<commit_message>
promote local -> dev (2026-07-15T14:25:54.221971+00:00)
</commit_message>
<xml_diff>
--- a/architecture/DevOpsBuildDeployAndEnvironmentManagement/ArchitectureDesignAndAuditDocs/DeploymentArchitectureDesignAndMigrationPlanPhase_v6.docx
+++ b/architecture/DevOpsBuildDeployAndEnvironmentManagement/ArchitectureDesignAndAuditDocs/DeploymentArchitectureDesignAndMigrationPlanPhase_v6.docx
@@ -449,16 +449,16 @@
         <w:t>Secrets</w:t>
       </w:r>
       <w:r>
-        <w:t xml:space="preserve"> — names configured on the server or hosting tool; values come from </w:t>
+        <w:t xml:space="preserve"> — names configured on the server or hosting tool; values are resolved at </w:t>
       </w:r>
       <w:r>
         <w:rPr>
-          <w:rFonts w:ascii="Consolas" w:hAnsi="Consolas"/>
+          <w:b/>
         </w:rPr>
-        <w:t>.env</w:t>
-      </w:r>
-      <w:r>
-        <w:t xml:space="preserve"> or secret stores at deploy time, not from JSON.</w:t>
+        <w:t>deploy</w:t>
+      </w:r>
+      <w:r>
+        <w:t xml:space="preserve"> time from the bound secret store (see §3.6). Secret values never appear in JSON or in build packages.</w:t>
       </w:r>
     </w:p>
     <w:p>
@@ -474,16 +474,34 @@
     </w:p>
     <w:p>
       <w:r>
-        <w:t xml:space="preserve">The local </w:t>
+        <w:t xml:space="preserve">The operator </w:t>
       </w:r>
       <w:r>
         <w:rPr>
           <w:rFonts w:ascii="Consolas" w:hAnsi="Consolas"/>
         </w:rPr>
-        <w:t>.env</w:t>
-      </w:r>
-      <w:r>
-        <w:t xml:space="preserve"> file is operator credential storage. It is not a row in </w:t>
+        <w:t>Code/.env</w:t>
+      </w:r>
+      <w:r>
+        <w:t xml:space="preserve"> file is one possible </w:t>
+      </w:r>
+      <w:r>
+        <w:rPr>
+          <w:b/>
+        </w:rPr>
+        <w:t>source</w:t>
+      </w:r>
+      <w:r>
+        <w:t xml:space="preserve"> for the </w:t>
+      </w:r>
+      <w:r>
+        <w:rPr>
+          <w:rFonts w:ascii="Consolas" w:hAnsi="Consolas"/>
+        </w:rPr>
+        <w:t>local_env</w:t>
+      </w:r>
+      <w:r>
+        <w:t xml:space="preserve"> store on the workstation plane. It is not the universal secret source for promoted cloud targets, and it is not a row in </w:t>
       </w:r>
       <w:r>
         <w:rPr>
@@ -618,6 +636,1472 @@
       </w:r>
       <w:r>
         <w:t>, and the small brain JSON subset a Hugging Face runtime reads). Those paths may appear on more than one target; everything else is exclusive. Crosswalk gains an exclusivity check; duplicates elsewhere fail the gate.</w:t>
+      </w:r>
+    </w:p>
+    <w:p>
+      <w:pPr>
+        <w:pStyle w:val="Heading3"/>
+      </w:pPr>
+      <w:r>
+        <w:t>3.6 Secret propagation to runtime nodes</w:t>
+      </w:r>
+    </w:p>
+    <w:p>
+      <w:r>
+        <w:t xml:space="preserve">Build produces </w:t>
+      </w:r>
+      <w:r>
+        <w:rPr>
+          <w:b/>
+        </w:rPr>
+        <w:t>code artifacts</w:t>
+      </w:r>
+      <w:r>
+        <w:t xml:space="preserve"> (staged trees, zips, Docker build contexts). It does </w:t>
+      </w:r>
+      <w:r>
+        <w:rPr>
+          <w:b/>
+        </w:rPr>
+        <w:t>not</w:t>
+      </w:r>
+      <w:r>
+        <w:t xml:space="preserve"> embed secret values. After Build, </w:t>
+      </w:r>
+      <w:r>
+        <w:rPr>
+          <w:b/>
+        </w:rPr>
+        <w:t>Deploy</w:t>
+      </w:r>
+      <w:r>
+        <w:t xml:space="preserve"> propagates configuration to each </w:t>
+      </w:r>
+      <w:r>
+        <w:rPr>
+          <w:b/>
+        </w:rPr>
+        <w:t>runtime node</w:t>
+      </w:r>
+      <w:r>
+        <w:t xml:space="preserve">—the process, container, Function App, or Container App revision that actually runs the staged bytes. Propagation is always </w:t>
+      </w:r>
+      <w:r>
+        <w:rPr>
+          <w:b/>
+        </w:rPr>
+        <w:t>name-driven</w:t>
+      </w:r>
+      <w:r>
+        <w:t xml:space="preserve"> from </w:t>
+      </w:r>
+      <w:r>
+        <w:rPr>
+          <w:rFonts w:ascii="Consolas" w:hAnsi="Consolas"/>
+        </w:rPr>
+        <w:t>deployment_architecture.json</w:t>
+      </w:r>
+      <w:r>
+        <w:t xml:space="preserve"> and </w:t>
+      </w:r>
+      <w:r>
+        <w:rPr>
+          <w:b/>
+        </w:rPr>
+        <w:t>value-driven</w:t>
+      </w:r>
+      <w:r>
+        <w:t xml:space="preserve"> from the store bound to each name.</w:t>
+      </w:r>
+    </w:p>
+    <w:p>
+      <w:r>
+        <w:t>#### 3.6.1 Manifest contract</w:t>
+      </w:r>
+    </w:p>
+    <w:p>
+      <w:r>
+        <w:t xml:space="preserve">Each </w:t>
+      </w:r>
+      <w:r>
+        <w:rPr>
+          <w:rFonts w:ascii="Consolas" w:hAnsi="Consolas"/>
+        </w:rPr>
+        <w:t>TargetRecord.secrets</w:t>
+      </w:r>
+      <w:r>
+        <w:t xml:space="preserve"> entry is </w:t>
+      </w:r>
+      <w:r>
+        <w:rPr>
+          <w:rFonts w:ascii="Consolas" w:hAnsi="Consolas"/>
+        </w:rPr>
+        <w:t>secret_name → store_id</w:t>
+      </w:r>
+      <w:r>
+        <w:t xml:space="preserve">. The closed store enum (per </w:t>
+      </w:r>
+      <w:r>
+        <w:rPr>
+          <w:rFonts w:ascii="Consolas" w:hAnsi="Consolas"/>
+        </w:rPr>
+        <w:t>ChatHealthyDeploymentArchitectureSchema.json</w:t>
+      </w:r>
+      <w:r>
+        <w:t>) is:</w:t>
+      </w:r>
+    </w:p>
+    <w:tbl>
+      <w:tblPr>
+        <w:tblStyle w:val="TableGrid"/>
+        <w:tblW w:type="auto" w:w="0"/>
+        <w:tblLook w:firstColumn="1" w:firstRow="1" w:lastColumn="0" w:lastRow="0" w:noHBand="0" w:noVBand="1" w:val="04A0"/>
+      </w:tblPr>
+      <w:tblGrid>
+        <w:gridCol w:w="4320"/>
+        <w:gridCol w:w="4320"/>
+      </w:tblGrid>
+      <w:tr>
+        <w:tc>
+          <w:tcPr>
+            <w:tcW w:type="dxa" w:w="4320"/>
+          </w:tcPr>
+          <w:p>
+            <w:r/>
+            <w:r>
+              <w:rPr>
+                <w:rFonts w:ascii="Consolas" w:hAnsi="Consolas"/>
+              </w:rPr>
+              <w:t>store_id</w:t>
+            </w:r>
+          </w:p>
+        </w:tc>
+        <w:tc>
+          <w:tcPr>
+            <w:tcW w:type="dxa" w:w="4320"/>
+          </w:tcPr>
+          <w:p>
+            <w:r/>
+            <w:r>
+              <w:t>Role</w:t>
+            </w:r>
+          </w:p>
+        </w:tc>
+      </w:tr>
+      <w:tr>
+        <w:tc>
+          <w:tcPr>
+            <w:tcW w:type="dxa" w:w="4320"/>
+          </w:tcPr>
+          <w:p>
+            <w:r/>
+            <w:r>
+              <w:rPr>
+                <w:rFonts w:ascii="Consolas" w:hAnsi="Consolas"/>
+              </w:rPr>
+              <w:t>local_env</w:t>
+            </w:r>
+          </w:p>
+        </w:tc>
+        <w:tc>
+          <w:tcPr>
+            <w:tcW w:type="dxa" w:w="4320"/>
+          </w:tcPr>
+          <w:p>
+            <w:r/>
+            <w:r>
+              <w:t xml:space="preserve">Workstation / local-plane only: read value from operator </w:t>
+            </w:r>
+            <w:r>
+              <w:rPr>
+                <w:rFonts w:ascii="Consolas" w:hAnsi="Consolas"/>
+              </w:rPr>
+              <w:t>Code/.env</w:t>
+            </w:r>
+            <w:r>
+              <w:t xml:space="preserve"> at deploy time</w:t>
+            </w:r>
+          </w:p>
+        </w:tc>
+      </w:tr>
+      <w:tr>
+        <w:tc>
+          <w:tcPr>
+            <w:tcW w:type="dxa" w:w="4320"/>
+          </w:tcPr>
+          <w:p>
+            <w:r/>
+            <w:r>
+              <w:rPr>
+                <w:rFonts w:ascii="Consolas" w:hAnsi="Consolas"/>
+              </w:rPr>
+              <w:t>gha_secret</w:t>
+            </w:r>
+          </w:p>
+        </w:tc>
+        <w:tc>
+          <w:tcPr>
+            <w:tcW w:type="dxa" w:w="4320"/>
+          </w:tcPr>
+          <w:p>
+            <w:r/>
+            <w:r>
+              <w:t>CI deploy runner: read from GitHub Actions secret for the workflow</w:t>
+            </w:r>
+          </w:p>
+        </w:tc>
+      </w:tr>
+      <w:tr>
+        <w:tc>
+          <w:tcPr>
+            <w:tcW w:type="dxa" w:w="4320"/>
+          </w:tcPr>
+          <w:p>
+            <w:r/>
+            <w:r>
+              <w:rPr>
+                <w:rFonts w:ascii="Consolas" w:hAnsi="Consolas"/>
+              </w:rPr>
+              <w:t>hf_space_secret</w:t>
+            </w:r>
+          </w:p>
+        </w:tc>
+        <w:tc>
+          <w:tcPr>
+            <w:tcW w:type="dxa" w:w="4320"/>
+          </w:tcPr>
+          <w:p>
+            <w:r/>
+            <w:r>
+              <w:t>Hugging Face Space runtime secret API</w:t>
+            </w:r>
+          </w:p>
+        </w:tc>
+      </w:tr>
+      <w:tr>
+        <w:tc>
+          <w:tcPr>
+            <w:tcW w:type="dxa" w:w="4320"/>
+          </w:tcPr>
+          <w:p>
+            <w:r/>
+            <w:r>
+              <w:rPr>
+                <w:rFonts w:ascii="Consolas" w:hAnsi="Consolas"/>
+              </w:rPr>
+              <w:t>cloudflare_env</w:t>
+            </w:r>
+          </w:p>
+        </w:tc>
+        <w:tc>
+          <w:tcPr>
+            <w:tcW w:type="dxa" w:w="4320"/>
+          </w:tcPr>
+          <w:p>
+            <w:r/>
+            <w:r>
+              <w:t>Cloudflare Pages environment variable API</w:t>
+            </w:r>
+          </w:p>
+        </w:tc>
+      </w:tr>
+      <w:tr>
+        <w:tc>
+          <w:tcPr>
+            <w:tcW w:type="dxa" w:w="4320"/>
+          </w:tcPr>
+          <w:p>
+            <w:r/>
+            <w:r>
+              <w:rPr>
+                <w:rFonts w:ascii="Consolas" w:hAnsi="Consolas"/>
+              </w:rPr>
+              <w:t>azure_function_app_setting</w:t>
+            </w:r>
+          </w:p>
+        </w:tc>
+        <w:tc>
+          <w:tcPr>
+            <w:tcW w:type="dxa" w:w="4320"/>
+          </w:tcPr>
+          <w:p>
+            <w:r/>
+            <w:r>
+              <w:t>Azure Function App application setting (runtime env on the FA host)</w:t>
+            </w:r>
+          </w:p>
+        </w:tc>
+      </w:tr>
+      <w:tr>
+        <w:tc>
+          <w:tcPr>
+            <w:tcW w:type="dxa" w:w="4320"/>
+          </w:tcPr>
+          <w:p>
+            <w:r/>
+            <w:r>
+              <w:rPr>
+                <w:rFonts w:ascii="Consolas" w:hAnsi="Consolas"/>
+              </w:rPr>
+              <w:t>azure_automation_variable</w:t>
+            </w:r>
+          </w:p>
+        </w:tc>
+        <w:tc>
+          <w:tcPr>
+            <w:tcW w:type="dxa" w:w="4320"/>
+          </w:tcPr>
+          <w:p>
+            <w:r/>
+            <w:r>
+              <w:t>Azure Automation Account variable (runbook runtime)</w:t>
+            </w:r>
+          </w:p>
+        </w:tc>
+      </w:tr>
+      <w:tr>
+        <w:tc>
+          <w:tcPr>
+            <w:tcW w:type="dxa" w:w="4320"/>
+          </w:tcPr>
+          <w:p>
+            <w:r/>
+            <w:r>
+              <w:rPr>
+                <w:rFonts w:ascii="Consolas" w:hAnsi="Consolas"/>
+              </w:rPr>
+              <w:t>azure_automation_webhook</w:t>
+            </w:r>
+          </w:p>
+        </w:tc>
+        <w:tc>
+          <w:tcPr>
+            <w:tcW w:type="dxa" w:w="4320"/>
+          </w:tcPr>
+          <w:p>
+            <w:r/>
+            <w:r>
+              <w:rPr>
+                <w:b/>
+              </w:rPr>
+              <w:t>Not resolved by SecretsResolver</w:t>
+            </w:r>
+            <w:r>
+              <w:t xml:space="preserve"> — upstream runbook deploy mints webhook URL and UPSERTs onto consumer FA app setting</w:t>
+            </w:r>
+          </w:p>
+        </w:tc>
+      </w:tr>
+    </w:tbl>
+    <w:p/>
+    <w:p>
+      <w:r>
+        <w:t xml:space="preserve">Secret </w:t>
+      </w:r>
+      <w:r>
+        <w:rPr>
+          <w:b/>
+        </w:rPr>
+        <w:t>values</w:t>
+      </w:r>
+      <w:r>
+        <w:t xml:space="preserve"> never appear in </w:t>
+      </w:r>
+      <w:r>
+        <w:rPr>
+          <w:rFonts w:ascii="Consolas" w:hAnsi="Consolas"/>
+        </w:rPr>
+        <w:t>deployment_architecture.json</w:t>
+      </w:r>
+      <w:r>
+        <w:t xml:space="preserve">, in </w:t>
+      </w:r>
+      <w:r>
+        <w:rPr>
+          <w:rFonts w:ascii="Consolas" w:hAnsi="Consolas"/>
+        </w:rPr>
+        <w:t>manifest.json</w:t>
+      </w:r>
+      <w:r>
+        <w:t xml:space="preserve">, or in any path under </w:t>
+      </w:r>
+      <w:r>
+        <w:rPr>
+          <w:rFonts w:ascii="Consolas" w:hAnsi="Consolas"/>
+        </w:rPr>
+        <w:t>localBuild/&lt;target_id&gt;/</w:t>
+      </w:r>
+      <w:r>
+        <w:t>. Rule-008 leak-check enforces this on staged build packages.</w:t>
+      </w:r>
+    </w:p>
+    <w:p>
+      <w:r>
+        <w:t xml:space="preserve">Per-target </w:t>
+      </w:r>
+      <w:r>
+        <w:rPr>
+          <w:rFonts w:ascii="Consolas" w:hAnsi="Consolas"/>
+        </w:rPr>
+        <w:t>variables</w:t>
+      </w:r>
+      <w:r>
+        <w:t xml:space="preserve"> (peer URLs, </w:t>
+      </w:r>
+      <w:r>
+        <w:rPr>
+          <w:rFonts w:ascii="Consolas" w:hAnsi="Consolas"/>
+        </w:rPr>
+        <w:t>env_name</w:t>
+      </w:r>
+      <w:r>
+        <w:t xml:space="preserve">, </w:t>
+      </w:r>
+      <w:r>
+        <w:rPr>
+          <w:rFonts w:ascii="Consolas" w:hAnsi="Consolas"/>
+        </w:rPr>
+        <w:t>literal:</w:t>
+      </w:r>
+      <w:r>
+        <w:t xml:space="preserve">, </w:t>
+      </w:r>
+      <w:r>
+        <w:rPr>
+          <w:rFonts w:ascii="Consolas" w:hAnsi="Consolas"/>
+        </w:rPr>
+        <w:t>rename_from:</w:t>
+      </w:r>
+      <w:r>
+        <w:t>, etc.) are deploy-computed bindings, not secrets; Deploy resolves them without going through the secret stores above.</w:t>
+      </w:r>
+    </w:p>
+    <w:p>
+      <w:r>
+        <w:t>#### 3.6.2 Two deploy modes</w:t>
+      </w:r>
+    </w:p>
+    <w:p>
+      <w:r>
+        <w:rPr>
+          <w:b/>
+        </w:rPr>
+        <w:t>Initial provision</w:t>
+      </w:r>
+      <w:r>
+        <w:t xml:space="preserve"> — runtime node does not yet carry the target's secret surface. Deploy must obtain each declared value from the bound store and </w:t>
+      </w:r>
+      <w:r>
+        <w:rPr>
+          <w:b/>
+        </w:rPr>
+        <w:t>write</w:t>
+      </w:r>
+      <w:r>
+        <w:t xml:space="preserve"> it to the server's native configuration API (FA app settings, ACA secret store, HF </w:t>
+      </w:r>
+      <w:r>
+        <w:rPr>
+          <w:rFonts w:ascii="Consolas" w:hAnsi="Consolas"/>
+        </w:rPr>
+        <w:t>set-secret</w:t>
+      </w:r>
+      <w:r>
+        <w:t>, Automation Variable PUT, etc.).</w:t>
+      </w:r>
+    </w:p>
+    <w:p>
+      <w:r>
+        <w:rPr>
+          <w:b/>
+        </w:rPr>
+        <w:t>Incremental / code-only deploy</w:t>
+      </w:r>
+      <w:r>
+        <w:t xml:space="preserve"> — runtime node already carries secrets from a prior successful deploy. Deploy must:</w:t>
+      </w:r>
+    </w:p>
+    <w:p>
+      <w:pPr>
+        <w:pStyle w:val="ListNumber"/>
+      </w:pPr>
+      <w:r>
+        <w:t xml:space="preserve">1. </w:t>
+      </w:r>
+      <w:r>
+        <w:t>Ship the new code artifact (zip push, image revision, runbook replace-content, etc.).</w:t>
+      </w:r>
+    </w:p>
+    <w:p>
+      <w:pPr>
+        <w:pStyle w:val="ListNumber"/>
+      </w:pPr>
+      <w:r>
+        <w:t xml:space="preserve">2. </w:t>
+      </w:r>
+      <w:r>
+        <w:rPr>
+          <w:b/>
+        </w:rPr>
+        <w:t>Preserve</w:t>
+      </w:r>
+      <w:r>
+        <w:t xml:space="preserve"> existing secret bindings unless the manifest binding changed or the operator explicitly rotates a value.</w:t>
+      </w:r>
+    </w:p>
+    <w:p>
+      <w:pPr>
+        <w:pStyle w:val="ListNumber"/>
+      </w:pPr>
+      <w:r>
+        <w:t xml:space="preserve">3. </w:t>
+      </w:r>
+      <w:r>
+        <w:rPr>
+          <w:b/>
+        </w:rPr>
+        <w:t>Not</w:t>
+      </w:r>
+      <w:r>
+        <w:t xml:space="preserve"> require a full operator </w:t>
+      </w:r>
+      <w:r>
+        <w:rPr>
+          <w:rFonts w:ascii="Consolas" w:hAnsi="Consolas"/>
+        </w:rPr>
+        <w:t>Code/.env</w:t>
+      </w:r>
+      <w:r>
+        <w:t xml:space="preserve"> on every laptop for promoted cloud targets.</w:t>
+      </w:r>
+    </w:p>
+    <w:p>
+      <w:r>
+        <w:t>Promoted pipeline targets (</w:t>
+      </w:r>
+      <w:r>
+        <w:rPr>
+          <w:rFonts w:ascii="Consolas" w:hAnsi="Consolas"/>
+        </w:rPr>
+        <w:t>target_azure_function_app_pipeline</w:t>
+      </w:r>
+      <w:r>
+        <w:t xml:space="preserve">, </w:t>
+      </w:r>
+      <w:r>
+        <w:rPr>
+          <w:rFonts w:ascii="Consolas" w:hAnsi="Consolas"/>
+        </w:rPr>
+        <w:t>target_azure_container_app_pipeline</w:t>
+      </w:r>
+      <w:r>
+        <w:t xml:space="preserve">) are </w:t>
+      </w:r>
+      <w:r>
+        <w:rPr>
+          <w:b/>
+        </w:rPr>
+        <w:t>cloud runtime nodes</w:t>
+      </w:r>
+      <w:r>
+        <w:t xml:space="preserve">. Their authoritative secret surface lives </w:t>
+      </w:r>
+      <w:r>
+        <w:rPr>
+          <w:b/>
+        </w:rPr>
+        <w:t>in Azure</w:t>
+      </w:r>
+      <w:r>
+        <w:t xml:space="preserve"> after first provision. Binding every pipeline key to </w:t>
+      </w:r>
+      <w:r>
+        <w:rPr>
+          <w:rFonts w:ascii="Consolas" w:hAnsi="Consolas"/>
+        </w:rPr>
+        <w:t>local_env</w:t>
+      </w:r>
+      <w:r>
+        <w:t xml:space="preserve"> is a manifest/implementation defect, not the design.</w:t>
+      </w:r>
+    </w:p>
+    <w:p>
+      <w:r>
+        <w:t xml:space="preserve">#### 3.6.3 Propagation path by </w:t>
+      </w:r>
+      <w:r>
+        <w:rPr>
+          <w:rFonts w:ascii="Consolas" w:hAnsi="Consolas"/>
+        </w:rPr>
+        <w:t>target_kind</w:t>
+      </w:r>
+    </w:p>
+    <w:p>
+      <w:r>
+        <w:t xml:space="preserve">Deploy reads </w:t>
+      </w:r>
+      <w:r>
+        <w:rPr>
+          <w:rFonts w:ascii="Consolas" w:hAnsi="Consolas"/>
+        </w:rPr>
+        <w:t>localBuild/&lt;target_id&gt;/manifest.json</w:t>
+      </w:r>
+      <w:r>
+        <w:t xml:space="preserve"> (file list + secret </w:t>
+      </w:r>
+      <w:r>
+        <w:rPr>
+          <w:b/>
+        </w:rPr>
+        <w:t>names</w:t>
+      </w:r>
+      <w:r>
+        <w:t xml:space="preserve"> and store ids only), then dispatches:</w:t>
+      </w:r>
+    </w:p>
+    <w:tbl>
+      <w:tblPr>
+        <w:tblStyle w:val="TableGrid"/>
+        <w:tblW w:type="auto" w:w="0"/>
+        <w:tblLook w:firstColumn="1" w:firstRow="1" w:lastColumn="0" w:lastRow="0" w:noHBand="0" w:noVBand="1" w:val="04A0"/>
+      </w:tblPr>
+      <w:tblGrid>
+        <w:gridCol w:w="2880"/>
+        <w:gridCol w:w="2880"/>
+        <w:gridCol w:w="2880"/>
+      </w:tblGrid>
+      <w:tr>
+        <w:tc>
+          <w:tcPr>
+            <w:tcW w:type="dxa" w:w="2880"/>
+          </w:tcPr>
+          <w:p>
+            <w:r/>
+            <w:r>
+              <w:rPr>
+                <w:rFonts w:ascii="Consolas" w:hAnsi="Consolas"/>
+              </w:rPr>
+              <w:t>target_kind</w:t>
+            </w:r>
+          </w:p>
+        </w:tc>
+        <w:tc>
+          <w:tcPr>
+            <w:tcW w:type="dxa" w:w="2880"/>
+          </w:tcPr>
+          <w:p>
+            <w:r/>
+            <w:r>
+              <w:t>Code artifact</w:t>
+            </w:r>
+          </w:p>
+        </w:tc>
+        <w:tc>
+          <w:tcPr>
+            <w:tcW w:type="dxa" w:w="2880"/>
+          </w:tcPr>
+          <w:p>
+            <w:r/>
+            <w:r>
+              <w:t>Secret propagation to runtime</w:t>
+            </w:r>
+          </w:p>
+        </w:tc>
+      </w:tr>
+      <w:tr>
+        <w:tc>
+          <w:tcPr>
+            <w:tcW w:type="dxa" w:w="2880"/>
+          </w:tcPr>
+          <w:p>
+            <w:r/>
+            <w:r>
+              <w:rPr>
+                <w:rFonts w:ascii="Consolas" w:hAnsi="Consolas"/>
+              </w:rPr>
+              <w:t>cloudflare_pages_project</w:t>
+            </w:r>
+          </w:p>
+        </w:tc>
+        <w:tc>
+          <w:tcPr>
+            <w:tcW w:type="dxa" w:w="2880"/>
+          </w:tcPr>
+          <w:p>
+            <w:r/>
+            <w:r>
+              <w:t>Staged static tree</w:t>
+            </w:r>
+          </w:p>
+        </w:tc>
+        <w:tc>
+          <w:tcPr>
+            <w:tcW w:type="dxa" w:w="2880"/>
+          </w:tcPr>
+          <w:p>
+            <w:r/>
+            <w:r>
+              <w:rPr>
+                <w:rFonts w:ascii="Consolas" w:hAnsi="Consolas"/>
+              </w:rPr>
+              <w:t>cloudflare_env</w:t>
+            </w:r>
+            <w:r>
+              <w:t>: Pages env vars via Wrangler/API</w:t>
+            </w:r>
+          </w:p>
+        </w:tc>
+      </w:tr>
+      <w:tr>
+        <w:tc>
+          <w:tcPr>
+            <w:tcW w:type="dxa" w:w="2880"/>
+          </w:tcPr>
+          <w:p>
+            <w:r/>
+            <w:r>
+              <w:rPr>
+                <w:rFonts w:ascii="Consolas" w:hAnsi="Consolas"/>
+              </w:rPr>
+              <w:t>hf_space</w:t>
+            </w:r>
+          </w:p>
+        </w:tc>
+        <w:tc>
+          <w:tcPr>
+            <w:tcW w:type="dxa" w:w="2880"/>
+          </w:tcPr>
+          <w:p>
+            <w:r/>
+            <w:r>
+              <w:t>Docker context → image</w:t>
+            </w:r>
+          </w:p>
+        </w:tc>
+        <w:tc>
+          <w:tcPr>
+            <w:tcW w:type="dxa" w:w="2880"/>
+          </w:tcPr>
+          <w:p>
+            <w:r/>
+            <w:r>
+              <w:rPr>
+                <w:rFonts w:ascii="Consolas" w:hAnsi="Consolas"/>
+              </w:rPr>
+              <w:t>hf_space_secret</w:t>
+            </w:r>
+            <w:r>
+              <w:t xml:space="preserve">: Space secrets API; non-secret </w:t>
+            </w:r>
+            <w:r>
+              <w:rPr>
+                <w:rFonts w:ascii="Consolas" w:hAnsi="Consolas"/>
+              </w:rPr>
+              <w:t>variables</w:t>
+            </w:r>
+            <w:r>
+              <w:t xml:space="preserve"> as Space env</w:t>
+            </w:r>
+          </w:p>
+        </w:tc>
+      </w:tr>
+      <w:tr>
+        <w:tc>
+          <w:tcPr>
+            <w:tcW w:type="dxa" w:w="2880"/>
+          </w:tcPr>
+          <w:p>
+            <w:r/>
+            <w:r>
+              <w:rPr>
+                <w:rFonts w:ascii="Consolas" w:hAnsi="Consolas"/>
+              </w:rPr>
+              <w:t>azure_function_app</w:t>
+            </w:r>
+          </w:p>
+        </w:tc>
+        <w:tc>
+          <w:tcPr>
+            <w:tcW w:type="dxa" w:w="2880"/>
+          </w:tcPr>
+          <w:p>
+            <w:r/>
+            <w:r>
+              <w:rPr>
+                <w:rFonts w:ascii="Consolas" w:hAnsi="Consolas"/>
+              </w:rPr>
+              <w:t>deploy.zip</w:t>
+            </w:r>
+            <w:r>
+              <w:t xml:space="preserve"> (code + pip vendor for gateway)</w:t>
+            </w:r>
+          </w:p>
+        </w:tc>
+        <w:tc>
+          <w:tcPr>
+            <w:tcW w:type="dxa" w:w="2880"/>
+          </w:tcPr>
+          <w:p>
+            <w:r/>
+            <w:r>
+              <w:rPr>
+                <w:rFonts w:ascii="Consolas" w:hAnsi="Consolas"/>
+              </w:rPr>
+              <w:t>azure_function_app_setting</w:t>
+            </w:r>
+            <w:r>
+              <w:t xml:space="preserve">: </w:t>
+            </w:r>
+            <w:r>
+              <w:rPr>
+                <w:rFonts w:ascii="Consolas" w:hAnsi="Consolas"/>
+              </w:rPr>
+              <w:t>az functionapp config appsettings set</w:t>
+            </w:r>
+            <w:r>
+              <w:t xml:space="preserve">; deploy-computed settings (e.g. </w:t>
+            </w:r>
+            <w:r>
+              <w:rPr>
+                <w:rFonts w:ascii="Consolas" w:hAnsi="Consolas"/>
+              </w:rPr>
+              <w:t>DURABLE_ROUTER_URL</w:t>
+            </w:r>
+            <w:r>
+              <w:t xml:space="preserve"> from ACA FQDN) merged in deploy handler</w:t>
+            </w:r>
+          </w:p>
+        </w:tc>
+      </w:tr>
+      <w:tr>
+        <w:tc>
+          <w:tcPr>
+            <w:tcW w:type="dxa" w:w="2880"/>
+          </w:tcPr>
+          <w:p>
+            <w:r/>
+            <w:r>
+              <w:rPr>
+                <w:rFonts w:ascii="Consolas" w:hAnsi="Consolas"/>
+              </w:rPr>
+              <w:t>azure_container_app</w:t>
+            </w:r>
+          </w:p>
+        </w:tc>
+        <w:tc>
+          <w:tcPr>
+            <w:tcW w:type="dxa" w:w="2880"/>
+          </w:tcPr>
+          <w:p>
+            <w:r/>
+            <w:r>
+              <w:t>Docker image → ACR</w:t>
+            </w:r>
+          </w:p>
+        </w:tc>
+        <w:tc>
+          <w:tcPr>
+            <w:tcW w:type="dxa" w:w="2880"/>
+          </w:tcPr>
+          <w:p>
+            <w:r/>
+            <w:r>
+              <w:t xml:space="preserve">ACA Container App </w:t>
+            </w:r>
+            <w:r>
+              <w:rPr>
+                <w:b/>
+              </w:rPr>
+              <w:t>secret store</w:t>
+            </w:r>
+            <w:r>
+              <w:t xml:space="preserve"> via </w:t>
+            </w:r>
+            <w:r>
+              <w:rPr>
+                <w:rFonts w:ascii="Consolas" w:hAnsi="Consolas"/>
+              </w:rPr>
+              <w:t>az containerapp secret set</w:t>
+            </w:r>
+            <w:r>
+              <w:t xml:space="preserve">; revision env vars reference secrets as </w:t>
+            </w:r>
+            <w:r>
+              <w:rPr>
+                <w:rFonts w:ascii="Consolas" w:hAnsi="Consolas"/>
+              </w:rPr>
+              <w:t>secretref:&lt;name&gt;</w:t>
+            </w:r>
+            <w:r>
+              <w:t>; plain env for deploy-computed values (</w:t>
+            </w:r>
+            <w:r>
+              <w:rPr>
+                <w:rFonts w:ascii="Consolas" w:hAnsi="Consolas"/>
+              </w:rPr>
+              <w:t>TaskHubName</w:t>
+            </w:r>
+            <w:r>
+              <w:t xml:space="preserve">, </w:t>
+            </w:r>
+            <w:r>
+              <w:rPr>
+                <w:rFonts w:ascii="Consolas" w:hAnsi="Consolas"/>
+              </w:rPr>
+              <w:t>APPLICATIONINSIGHTS_CONNECTION_STRING</w:t>
+            </w:r>
+            <w:r>
+              <w:t>, etc.)</w:t>
+            </w:r>
+          </w:p>
+        </w:tc>
+      </w:tr>
+      <w:tr>
+        <w:tc>
+          <w:tcPr>
+            <w:tcW w:type="dxa" w:w="2880"/>
+          </w:tcPr>
+          <w:p>
+            <w:r/>
+            <w:r>
+              <w:rPr>
+                <w:rFonts w:ascii="Consolas" w:hAnsi="Consolas"/>
+              </w:rPr>
+              <w:t>azure_automation_runbook</w:t>
+            </w:r>
+          </w:p>
+        </w:tc>
+        <w:tc>
+          <w:tcPr>
+            <w:tcW w:type="dxa" w:w="2880"/>
+          </w:tcPr>
+          <w:p>
+            <w:r/>
+            <w:r>
+              <w:rPr>
+                <w:rFonts w:ascii="Consolas" w:hAnsi="Consolas"/>
+              </w:rPr>
+              <w:t>runbook.py</w:t>
+            </w:r>
+          </w:p>
+        </w:tc>
+        <w:tc>
+          <w:tcPr>
+            <w:tcW w:type="dxa" w:w="2880"/>
+          </w:tcPr>
+          <w:p>
+            <w:r/>
+            <w:r>
+              <w:rPr>
+                <w:rFonts w:ascii="Consolas" w:hAnsi="Consolas"/>
+              </w:rPr>
+              <w:t>azure_automation_variable</w:t>
+            </w:r>
+            <w:r>
+              <w:t xml:space="preserve">: Automation Variable PUT; missing keys </w:t>
+            </w:r>
+            <w:r>
+              <w:rPr>
+                <w:b/>
+              </w:rPr>
+              <w:t>skipped</w:t>
+            </w:r>
+            <w:r>
+              <w:t xml:space="preserve"> if not in operator store; </w:t>
+            </w:r>
+            <w:r>
+              <w:rPr>
+                <w:rFonts w:ascii="Consolas" w:hAnsi="Consolas"/>
+              </w:rPr>
+              <w:t>azure_automation_webhook</w:t>
+            </w:r>
+            <w:r>
+              <w:t xml:space="preserve"> URLs pushed by runbook deploy onto consumer FA</w:t>
+            </w:r>
+          </w:p>
+        </w:tc>
+      </w:tr>
+      <w:tr>
+        <w:tc>
+          <w:tcPr>
+            <w:tcW w:type="dxa" w:w="2880"/>
+          </w:tcPr>
+          <w:p>
+            <w:r/>
+            <w:r>
+              <w:rPr>
+                <w:rFonts w:ascii="Consolas" w:hAnsi="Consolas"/>
+              </w:rPr>
+              <w:t>host_os_process</w:t>
+            </w:r>
+            <w:r>
+              <w:t xml:space="preserve"> / local Docker</w:t>
+            </w:r>
+          </w:p>
+        </w:tc>
+        <w:tc>
+          <w:tcPr>
+            <w:tcW w:type="dxa" w:w="2880"/>
+          </w:tcPr>
+          <w:p>
+            <w:r/>
+            <w:r>
+              <w:t>Local tree / image</w:t>
+            </w:r>
+          </w:p>
+        </w:tc>
+        <w:tc>
+          <w:tcPr>
+            <w:tcW w:type="dxa" w:w="2880"/>
+          </w:tcPr>
+          <w:p>
+            <w:r/>
+            <w:r>
+              <w:rPr>
+                <w:rFonts w:ascii="Consolas" w:hAnsi="Consolas"/>
+              </w:rPr>
+              <w:t>local_env</w:t>
+            </w:r>
+            <w:r>
+              <w:t xml:space="preserve"> from </w:t>
+            </w:r>
+            <w:r>
+              <w:rPr>
+                <w:rFonts w:ascii="Consolas" w:hAnsi="Consolas"/>
+              </w:rPr>
+              <w:t>Code/.env</w:t>
+            </w:r>
+            <w:r>
+              <w:t xml:space="preserve">; local </w:t>
+            </w:r>
+            <w:r>
+              <w:rPr>
+                <w:rFonts w:ascii="Consolas" w:hAnsi="Consolas"/>
+              </w:rPr>
+              <w:t>variables</w:t>
+            </w:r>
+            <w:r>
+              <w:t xml:space="preserve"> for peer URLs and certs</w:t>
+            </w:r>
+          </w:p>
+        </w:tc>
+      </w:tr>
+    </w:tbl>
+    <w:p/>
+    <w:p>
+      <w:r>
+        <w:rPr>
+          <w:b/>
+        </w:rPr>
+        <w:t>Build → runtime flow (pipeline example):</w:t>
+      </w:r>
+    </w:p>
+    <w:p>
+      <w:pPr>
+        <w:pStyle w:val="IntenseQuote"/>
+      </w:pPr>
+      <w:r>
+        <w:t xml:space="preserve">  build_chathealthy.py                    deploy_chathealthy.py</w:t>
+        <w:br/>
+        <w:t xml:space="preserve">  ─────────────────────                   ──────────────────────</w:t>
+        <w:br/>
+        <w:t xml:space="preserve">  files[] → localBuild/.../app/           docker build + push (ACA)</w:t>
+        <w:br/>
+        <w:t xml:space="preserve">           or deploy.zip (FA)      →      aca_set_secrets / FA appsettings set</w:t>
+        <w:br/>
+        <w:t xml:space="preserve">  manifest.json (names only)              new revision / zip mount</w:t>
+        <w:br/>
+        <w:t xml:space="preserve">                                          runtime reads os.environ / secretref</w:t>
+      </w:r>
+    </w:p>
+    <w:p>
+      <w:r>
+        <w:t xml:space="preserve">The Container App </w:t>
+      </w:r>
+      <w:r>
+        <w:rPr>
+          <w:b/>
+        </w:rPr>
+        <w:t>image</w:t>
+      </w:r>
+      <w:r>
+        <w:t xml:space="preserve"> contains only Python source and </w:t>
+      </w:r>
+      <w:r>
+        <w:rPr>
+          <w:rFonts w:ascii="Consolas" w:hAnsi="Consolas"/>
+        </w:rPr>
+        <w:t>requirements.txt</w:t>
+      </w:r>
+      <w:r>
+        <w:t>. At container start, the Functions worker reads env vars injected by ACA from the secret store—not from layers baked into the image.</w:t>
+      </w:r>
+    </w:p>
+    <w:p>
+      <w:r>
+        <w:t xml:space="preserve">#### 3.6.4 </w:t>
+      </w:r>
+      <w:r>
+        <w:rPr>
+          <w:rFonts w:ascii="Consolas" w:hAnsi="Consolas"/>
+        </w:rPr>
+        <w:t>SecretsResolver</w:t>
+      </w:r>
+      <w:r>
+        <w:t xml:space="preserve"> and retrieval audit</w:t>
+      </w:r>
+    </w:p>
+    <w:p>
+      <w:r>
+        <w:rPr>
+          <w:rFonts w:ascii="Consolas" w:hAnsi="Consolas"/>
+        </w:rPr>
+        <w:t>SecretsResolver</w:t>
+      </w:r>
+      <w:r>
+        <w:t xml:space="preserve"> (in </w:t>
+      </w:r>
+      <w:r>
+        <w:rPr>
+          <w:rFonts w:ascii="Consolas" w:hAnsi="Consolas"/>
+        </w:rPr>
+        <w:t>secrets_resolver.py</w:t>
+      </w:r>
+      <w:r>
+        <w:t xml:space="preserve">) is the single value-fetch path per </w:t>
+      </w:r>
+      <w:r>
+        <w:rPr>
+          <w:rFonts w:ascii="Consolas" w:hAnsi="Consolas"/>
+        </w:rPr>
+        <w:t>(secret_name, env_binding)</w:t>
+      </w:r>
+      <w:r>
+        <w:t xml:space="preserve"> binding. It must consult </w:t>
+      </w:r>
+      <w:r>
+        <w:rPr>
+          <w:b/>
+        </w:rPr>
+        <w:t>only</w:t>
+      </w:r>
+      <w:r>
+        <w:t xml:space="preserve"> the store declared in the manifest—no cross-store fallback.</w:t>
+      </w:r>
+    </w:p>
+    <w:p>
+      <w:r>
+        <w:t>The workbook (</w:t>
+      </w:r>
+      <w:r>
+        <w:rPr>
+          <w:rFonts w:ascii="Consolas" w:hAnsi="Consolas"/>
+        </w:rPr>
+        <w:t>deployment_facts_inventory_&lt;date&gt;.csv</w:t>
+      </w:r>
+      <w:r>
+        <w:t xml:space="preserve">) projects each secret row with </w:t>
+      </w:r>
+      <w:r>
+        <w:rPr>
+          <w:rFonts w:ascii="Consolas" w:hAnsi="Consolas"/>
+        </w:rPr>
+        <w:t>retrieval_store</w:t>
+      </w:r>
+      <w:r>
+        <w:t xml:space="preserve"> and </w:t>
+      </w:r>
+      <w:r>
+        <w:rPr>
+          <w:rFonts w:ascii="Consolas" w:hAnsi="Consolas"/>
+        </w:rPr>
+        <w:t>retrieval_action</w:t>
+      </w:r>
+      <w:r>
+        <w:t xml:space="preserve"> columns so operators can see how Deploy obtains or writes each value. Example actions:</w:t>
+      </w:r>
+    </w:p>
+    <w:p>
+      <w:pPr>
+        <w:pStyle w:val="ListBullet"/>
+      </w:pPr>
+      <w:r>
+        <w:rPr>
+          <w:rFonts w:ascii="Consolas" w:hAnsi="Consolas"/>
+        </w:rPr>
+        <w:t>local_env</w:t>
+      </w:r>
+      <w:r>
+        <w:t xml:space="preserve"> → read key from </w:t>
+      </w:r>
+      <w:r>
+        <w:rPr>
+          <w:rFonts w:ascii="Consolas" w:hAnsi="Consolas"/>
+        </w:rPr>
+        <w:t>Code/.env</w:t>
+      </w:r>
+      <w:r>
+        <w:t xml:space="preserve"> at deploy (workstation / first-time local only)</w:t>
+      </w:r>
+    </w:p>
+    <w:p>
+      <w:pPr>
+        <w:pStyle w:val="ListBullet"/>
+      </w:pPr>
+      <w:r>
+        <w:rPr>
+          <w:rFonts w:ascii="Consolas" w:hAnsi="Consolas"/>
+        </w:rPr>
+        <w:t>azure_function_app_setting</w:t>
+      </w:r>
+      <w:r>
+        <w:t xml:space="preserve"> → read existing FA setting and/or </w:t>
+      </w:r>
+      <w:r>
+        <w:rPr>
+          <w:rFonts w:ascii="Consolas" w:hAnsi="Consolas"/>
+        </w:rPr>
+        <w:t>az functionapp config appsettings set</w:t>
+      </w:r>
+      <w:r>
+        <w:t xml:space="preserve"> at deploy</w:t>
+      </w:r>
+    </w:p>
+    <w:p>
+      <w:pPr>
+        <w:pStyle w:val="ListBullet"/>
+      </w:pPr>
+      <w:r>
+        <w:rPr>
+          <w:rFonts w:ascii="Consolas" w:hAnsi="Consolas"/>
+        </w:rPr>
+        <w:t>azure_automation_variable</w:t>
+      </w:r>
+      <w:r>
+        <w:t xml:space="preserve"> → Automation Variable PUT on deploy account</w:t>
+      </w:r>
+    </w:p>
+    <w:p>
+      <w:r>
+        <w:t>#### 3.6.5 Implementation gap (2026-07)</w:t>
+      </w:r>
+    </w:p>
+    <w:p>
+      <w:r>
+        <w:t>Today:</w:t>
+      </w:r>
+    </w:p>
+    <w:p>
+      <w:pPr>
+        <w:pStyle w:val="ListBullet"/>
+      </w:pPr>
+      <w:r>
+        <w:rPr>
+          <w:rFonts w:ascii="Consolas" w:hAnsi="Consolas"/>
+        </w:rPr>
+        <w:t>SecretsResolver</w:t>
+      </w:r>
+      <w:r>
+        <w:t xml:space="preserve"> wires </w:t>
+      </w:r>
+      <w:r>
+        <w:rPr>
+          <w:b/>
+        </w:rPr>
+        <w:t>`local_env` only</w:t>
+      </w:r>
+      <w:r>
+        <w:t xml:space="preserve">; other stores raise </w:t>
+      </w:r>
+      <w:r>
+        <w:rPr>
+          <w:rFonts w:ascii="Consolas" w:hAnsi="Consolas"/>
+        </w:rPr>
+        <w:t>NotImplementedError</w:t>
+      </w:r>
+      <w:r>
+        <w:t>.</w:t>
+      </w:r>
+    </w:p>
+    <w:p>
+      <w:pPr>
+        <w:pStyle w:val="ListBullet"/>
+      </w:pPr>
+      <w:r>
+        <w:t xml:space="preserve">Pipeline ACA deploy resolves </w:t>
+      </w:r>
+      <w:r>
+        <w:rPr>
+          <w:b/>
+        </w:rPr>
+        <w:t>every</w:t>
+      </w:r>
+      <w:r>
+        <w:t xml:space="preserve"> manifest secret from </w:t>
+      </w:r>
+      <w:r>
+        <w:rPr>
+          <w:rFonts w:ascii="Consolas" w:hAnsi="Consolas"/>
+        </w:rPr>
+        <w:t>local_env</w:t>
+      </w:r>
+      <w:r>
+        <w:t xml:space="preserve"> and </w:t>
+      </w:r>
+      <w:r>
+        <w:rPr>
+          <w:b/>
+        </w:rPr>
+        <w:t>fails hard</w:t>
+      </w:r>
+      <w:r>
+        <w:t xml:space="preserve"> on </w:t>
+      </w:r>
+      <w:r>
+        <w:rPr>
+          <w:rFonts w:ascii="Consolas" w:hAnsi="Consolas"/>
+        </w:rPr>
+        <w:t>KeyError</w:t>
+      </w:r>
+      <w:r>
+        <w:t xml:space="preserve"> (unlike automation runbook deploy, which skips missing keys).</w:t>
+      </w:r>
+    </w:p>
+    <w:p>
+      <w:pPr>
+        <w:pStyle w:val="ListBullet"/>
+      </w:pPr>
+      <w:r>
+        <w:t xml:space="preserve">Many cloud pipeline keys are incorrectly bound to </w:t>
+      </w:r>
+      <w:r>
+        <w:rPr>
+          <w:rFonts w:ascii="Consolas" w:hAnsi="Consolas"/>
+        </w:rPr>
+        <w:t>local_env</w:t>
+      </w:r>
+      <w:r>
+        <w:t xml:space="preserve"> in </w:t>
+      </w:r>
+      <w:r>
+        <w:rPr>
+          <w:rFonts w:ascii="Consolas" w:hAnsi="Consolas"/>
+        </w:rPr>
+        <w:t>deployment_architecture.json</w:t>
+      </w:r>
+      <w:r>
+        <w:t>.</w:t>
+      </w:r>
+    </w:p>
+    <w:p>
+      <w:r>
+        <w:rPr>
+          <w:b/>
+        </w:rPr>
+        <w:t>Required closure (EPIC-008-F-012):</w:t>
+      </w:r>
+    </w:p>
+    <w:p>
+      <w:pPr>
+        <w:pStyle w:val="ListNumber"/>
+      </w:pPr>
+      <w:r>
+        <w:t xml:space="preserve">1. </w:t>
+      </w:r>
+      <w:r>
+        <w:t>Rebind promoted cloud targets to the correct store ids (</w:t>
+      </w:r>
+      <w:r>
+        <w:rPr>
+          <w:rFonts w:ascii="Consolas" w:hAnsi="Consolas"/>
+        </w:rPr>
+        <w:t>azure_function_app_setting</w:t>
+      </w:r>
+      <w:r>
+        <w:t xml:space="preserve">, ACA secret store via deploy handler, </w:t>
+      </w:r>
+      <w:r>
+        <w:rPr>
+          <w:rFonts w:ascii="Consolas" w:hAnsi="Consolas"/>
+        </w:rPr>
+        <w:t>gha_secret</w:t>
+      </w:r>
+      <w:r>
+        <w:t xml:space="preserve"> in CI).</w:t>
+      </w:r>
+    </w:p>
+    <w:p>
+      <w:pPr>
+        <w:pStyle w:val="ListNumber"/>
+      </w:pPr>
+      <w:r>
+        <w:t xml:space="preserve">2. </w:t>
+      </w:r>
+      <w:r>
+        <w:t xml:space="preserve">Implement store readers and </w:t>
+      </w:r>
+      <w:r>
+        <w:rPr>
+          <w:b/>
+        </w:rPr>
+        <w:t>incremental deploy</w:t>
+      </w:r>
+      <w:r>
+        <w:t xml:space="preserve">: code push without re-sourcing all values from operator </w:t>
+      </w:r>
+      <w:r>
+        <w:rPr>
+          <w:rFonts w:ascii="Consolas" w:hAnsi="Consolas"/>
+        </w:rPr>
+        <w:t>.env</w:t>
+      </w:r>
+      <w:r>
+        <w:t>.</w:t>
+      </w:r>
+    </w:p>
+    <w:p>
+      <w:pPr>
+        <w:pStyle w:val="ListNumber"/>
+      </w:pPr>
+      <w:r>
+        <w:t xml:space="preserve">3. </w:t>
+      </w:r>
+      <w:r>
+        <w:t>Document per-target minimal secret sets (LLD v22 pipeline router needs fewer keys than legacy Durable worker).</w:t>
+      </w:r>
+    </w:p>
+    <w:p>
+      <w:pPr>
+        <w:pStyle w:val="ListNumber"/>
+      </w:pPr>
+      <w:r>
+        <w:t xml:space="preserve">4. </w:t>
+      </w:r>
+      <w:r>
+        <w:t>Keep Rule-008 leak-check: build packages remain secret-free.</w:t>
+      </w:r>
+    </w:p>
+    <w:p>
+      <w:r>
+        <w:t xml:space="preserve">Until that closure ships, a successful </w:t>
+      </w:r>
+      <w:r>
+        <w:rPr>
+          <w:b/>
+        </w:rPr>
+        <w:t>code-only</w:t>
+      </w:r>
+      <w:r>
+        <w:t xml:space="preserve"> cloud pipeline deploy must not be blocked by absent workstation </w:t>
+      </w:r>
+      <w:r>
+        <w:rPr>
+          <w:rFonts w:ascii="Consolas" w:hAnsi="Consolas"/>
+        </w:rPr>
+        <w:t>.env</w:t>
+      </w:r>
+      <w:r>
+        <w:t xml:space="preserve"> keys that already live on the Azure runtime node.</w:t>
       </w:r>
     </w:p>
     <w:p>
@@ -685,9 +2169,9 @@
         <w:br/>
         <w:t xml:space="preserve">  Promote:  local → dev → qa → prod</w:t>
         <w:br/>
-        <w:t xml:space="preserve">  Build:    files[] + variables[]  →  staged tree + manifest.json</w:t>
+        <w:t xml:space="preserve">  Build:    files[] + variables[]  →  staged tree + manifest.json (no secret values)</w:t>
         <w:br/>
-        <w:t xml:space="preserve">  Deploy:   package + secrets        →  Cloudflare / HF / Azure / local Docker</w:t>
+        <w:t xml:space="preserve">  Deploy:   package + secret names →  resolve stores → runtime node config APIs</w:t>
       </w:r>
     </w:p>
     <w:p>
@@ -1063,6 +2547,42 @@
             <w:r/>
             <w:r>
               <w:t>Pipeline HTTP gateway (prod-shared)</w:t>
+            </w:r>
+          </w:p>
+        </w:tc>
+      </w:tr>
+      <w:tr>
+        <w:tc>
+          <w:tcPr>
+            <w:tcW w:type="dxa" w:w="4320"/>
+          </w:tcPr>
+          <w:p>
+            <w:r/>
+            <w:r>
+              <w:rPr>
+                <w:rFonts w:ascii="Consolas" w:hAnsi="Consolas"/>
+              </w:rPr>
+              <w:t>target_azure_container_app_pipeline</w:t>
+            </w:r>
+          </w:p>
+        </w:tc>
+        <w:tc>
+          <w:tcPr>
+            <w:tcW w:type="dxa" w:w="4320"/>
+          </w:tcPr>
+          <w:p>
+            <w:r/>
+            <w:r>
+              <w:t xml:space="preserve">Pipeline Durable/LLD worker (ACA; ingress </w:t>
+            </w:r>
+            <w:r>
+              <w:rPr>
+                <w:rFonts w:ascii="Consolas" w:hAnsi="Consolas"/>
+              </w:rPr>
+              <w:t>/api/Router</w:t>
+            </w:r>
+            <w:r>
+              <w:t>)</w:t>
             </w:r>
           </w:p>
         </w:tc>
@@ -1761,7 +3281,16 @@
     </w:p>
     <w:p>
       <w:r>
-        <w:t>Deploy owns secrets and placement.</w:t>
+        <w:t xml:space="preserve">Deploy owns secrets and placement (see </w:t>
+      </w:r>
+      <w:r>
+        <w:rPr>
+          <w:b/>
+        </w:rPr>
+        <w:t>§3.6 Secret propagation to runtime nodes</w:t>
+      </w:r>
+      <w:r>
+        <w:t>).</w:t>
       </w:r>
     </w:p>
     <w:p>
@@ -1806,16 +3335,52 @@
         <w:t xml:space="preserve">2. </w:t>
       </w:r>
       <w:r>
-        <w:t xml:space="preserve">Resolves secrets through the secret-management path (names from JSON, values from </w:t>
+        <w:t xml:space="preserve">Resolves each </w:t>
       </w:r>
       <w:r>
         <w:rPr>
           <w:rFonts w:ascii="Consolas" w:hAnsi="Consolas"/>
         </w:rPr>
-        <w:t>.env</w:t>
-      </w:r>
-      <w:r>
-        <w:t xml:space="preserve"> and stores).</w:t>
+        <w:t>secrets</w:t>
+      </w:r>
+      <w:r>
+        <w:t xml:space="preserve"> binding via </w:t>
+      </w:r>
+      <w:r>
+        <w:rPr>
+          <w:rFonts w:ascii="Consolas" w:hAnsi="Consolas"/>
+        </w:rPr>
+        <w:t>SecretsResolver</w:t>
+      </w:r>
+      <w:r>
+        <w:t xml:space="preserve"> (or target-specific handlers for </w:t>
+      </w:r>
+      <w:r>
+        <w:rPr>
+          <w:rFonts w:ascii="Consolas" w:hAnsi="Consolas"/>
+        </w:rPr>
+        <w:t>azure_automation_webhook</w:t>
+      </w:r>
+      <w:r>
+        <w:t xml:space="preserve"> and deploy-computed </w:t>
+      </w:r>
+      <w:r>
+        <w:rPr>
+          <w:rFonts w:ascii="Consolas" w:hAnsi="Consolas"/>
+        </w:rPr>
+        <w:t>variables</w:t>
+      </w:r>
+      <w:r>
+        <w:t xml:space="preserve">), then </w:t>
+      </w:r>
+      <w:r>
+        <w:rPr>
+          <w:b/>
+        </w:rPr>
+        <w:t>writes</w:t>
+      </w:r>
+      <w:r>
+        <w:t xml:space="preserve"> values to the runtime node's native configuration surface (FA app settings, ACA secret store, HF/Cloudflare APIs, Automation Variables, local Docker env).</w:t>
       </w:r>
     </w:p>
     <w:p>
@@ -1835,7 +3400,7 @@
         <w:t>target_kind</w:t>
       </w:r>
       <w:r>
-        <w:t>: Cloudflare Wrangler, HF docker build/push and Space update, Azure function deploy, automation runbook publish, local Docker and host services.</w:t>
+        <w:t>: Cloudflare Wrangler, HF docker build/push and Space update, Azure function deploy, ACA image revision, automation runbook publish, local Docker and host services.</w:t>
       </w:r>
     </w:p>
     <w:p>
@@ -1861,6 +3426,17 @@
       </w:r>
       <w:r>
         <w:t xml:space="preserve"> (Space names, Pages projects, Function App resources). That intimacy lives here—not in Build.</w:t>
+      </w:r>
+    </w:p>
+    <w:p>
+      <w:r>
+        <w:rPr>
+          <w:b/>
+        </w:rPr>
+        <w:t>Incremental deploy rule:</w:t>
+      </w:r>
+      <w:r>
+        <w:t xml:space="preserve"> shipping a new build package must not require the operator workstation to hold a complete copy of every cloud secret. After initial provision, the runtime node's store is authoritative; Deploy updates code and only touches secrets that are new, rotated, or deploy-computed.</w:t>
       </w:r>
     </w:p>
     <w:p>
@@ -1943,6 +3519,62 @@
       </w:r>
       <w:r>
         <w:t xml:space="preserve"> Vendor names in field names; shape does not match the neutral target model.</w:t>
+      </w:r>
+    </w:p>
+    <w:p>
+      <w:r>
+        <w:rPr>
+          <w:b/>
+        </w:rPr>
+        <w:t>Secret propagation.</w:t>
+      </w:r>
+      <w:r>
+        <w:t xml:space="preserve"> Manifest schema and backlog (REQ-T-037/T-038) define per-target </w:t>
+      </w:r>
+      <w:r>
+        <w:rPr>
+          <w:rFonts w:ascii="Consolas" w:hAnsi="Consolas"/>
+        </w:rPr>
+        <w:t>secrets</w:t>
+      </w:r>
+      <w:r>
+        <w:t xml:space="preserve"> → </w:t>
+      </w:r>
+      <w:r>
+        <w:rPr>
+          <w:rFonts w:ascii="Consolas" w:hAnsi="Consolas"/>
+        </w:rPr>
+        <w:t>store_id</w:t>
+      </w:r>
+      <w:r>
+        <w:t xml:space="preserve"> bindings and forbid values in build packages. Implementation still overuses </w:t>
+      </w:r>
+      <w:r>
+        <w:rPr>
+          <w:rFonts w:ascii="Consolas" w:hAnsi="Consolas"/>
+        </w:rPr>
+        <w:t>local_env</w:t>
+      </w:r>
+      <w:r>
+        <w:t xml:space="preserve"> on cloud pipeline targets and does not implement </w:t>
+      </w:r>
+      <w:r>
+        <w:rPr>
+          <w:rFonts w:ascii="Consolas" w:hAnsi="Consolas"/>
+        </w:rPr>
+        <w:t>azure_function_app_setting</w:t>
+      </w:r>
+      <w:r>
+        <w:t xml:space="preserve"> / incremental ACA deploy (§3.6.5). Pipeline ACA deploy incorrectly requires a full operator </w:t>
+      </w:r>
+      <w:r>
+        <w:rPr>
+          <w:rFonts w:ascii="Consolas" w:hAnsi="Consolas"/>
+        </w:rPr>
+        <w:t>Code/.env</w:t>
+      </w:r>
+      <w:r>
+        <w:t xml:space="preserve"> on every run.</w:t>
       </w:r>
     </w:p>
     <w:p>

</xml_diff>